<commit_message>
Department name: Information System
Co-Authored-By: Claude Sonnet 5.5 <noreply@anthropic.com>
Claude-Session: https://claude.ai/code/session_017rpe9Z3CoCCyiANf2szbvW
</commit_message>
<xml_diff>
--- a/isr-revision/submission/Title_Page.docx
+++ b/isr-revision/submission/Title_Page.docx
@@ -66,7 +66,7 @@
           <w:sz w:val="24"/>
           <w:szCs w:val="24"/>
         </w:rPr>
-        <w:t xml:space="preserve">Ook Lee, Department of Information Systems, Hanyang University, Seoul, Korea</w:t>
+        <w:t xml:space="preserve">Ook Lee, Department of Information System, Hanyang University, Seoul, Korea</w:t>
       </w:r>
     </w:p>
     <w:p>
@@ -94,7 +94,7 @@
           <w:sz w:val="24"/>
           <w:szCs w:val="24"/>
         </w:rPr>
-        <w:t xml:space="preserve">Ook Lee, Department of Information Systems, Hanyang University, Seoul, Korea. Email: ooklee@hanyang.ac.kr</w:t>
+        <w:t xml:space="preserve">Ook Lee, Department of Information System, Hanyang University, Seoul, Korea. Email: ooklee@hanyang.ac.kr</w:t>
       </w:r>
     </w:p>
     <w:p>

</xml_diff>